<commit_message>
Prompt guide: 6 components (task, data sample, verification) per Prof. Chen's review; keep application template verbatim
- M1: add task/sample/verify components, improved prompt next to the approved template, sample-data cell
- M2: plotting prompt names Colab Chinese font and asks to print data first
- Tagline: no need to memorize syntax, but describe needs, read results, catch errors
- W13 worksheet lists the 6 components

Co-Authored-By: Claude Opus 5.5 <noreply@anthropic.com>
</commit_message>
<xml_diff>
--- a/worksheets/W13_M1.docx
+++ b/worksheets/W13_M1.docx
@@ -2181,7 +2181,7 @@
           <w:b w:val="0"/>
           <w:sz w:val="24"/>
         </w:rPr>
-        <w:t>記錄你從第一版 Prompt 到「能成功抓到資料」的最後一版。好的 Prompt 通常包含：</w:t>
+        <w:t>記錄你從第一版 Prompt 到「能成功抓到資料」的最後一版。好的 Prompt 有 6 個零件：</w:t>
       </w:r>
       <w:r>
         <w:rPr>
@@ -2189,7 +2189,7 @@
           <w:b/>
           <w:sz w:val="24"/>
         </w:rPr>
-        <w:t>角色、資料來源（DataID）、要的欄位、輸出格式、執行環境（Colab）、註解語言</w:t>
+        <w:t>① 任務（想回答的問題）② 資料來源＋資料樣子（DataID、2 筆樣本、測站與時間範圍）③ 英文欄位名 ④ 輸出形式 ⑤ 限制與說明（Colab、中文註解、角色）⑥ 驗證（先印出欄位與前 5 筆讓我確認）</w:t>
       </w:r>
       <w:r>
         <w:rPr>

</xml_diff>